<commit_message>
Map AI survey answers to brand operations department.
Include all Q6 AI responses under 品牌运营部, update the department
summary, and regenerate Markdown/Excel/Word deliverables.

Co-authored-by: liborvybral-collab <liborvybral-collab@users.noreply.github.com>
</commit_message>
<xml_diff>
--- a/docs/reports/surveys/2026-fy-internal-management/各部门调研问题梳理.docx
+++ b/docs/reports/surveys/2026-fy-internal-management/各部门调研问题梳理.docx
@@ -12,7 +12,7 @@
     </w:p>
     <w:p>
       <w:r>
-        <w:t>体例：每个部门先写问题提炼，再完整收录相关员工答卷原文（不做删改）。同一答卷若涉及多部门会重复收录。</w:t>
+        <w:t>体例：每个部门先写问题提炼，再完整收录相关员工答卷原文（不做删改）。Q1品牌宣传与Q6 AI应用整题归口品牌运营部。</w:t>
       </w:r>
     </w:p>
     <w:p>
@@ -83,7 +83,7 @@
           </w:tcPr>
           <w:p>
             <w:r>
-              <w:t>58</w:t>
+              <w:t>115</w:t>
             </w:r>
           </w:p>
         </w:tc>
@@ -93,7 +93,7 @@
           </w:tcPr>
           <w:p>
             <w:r>
-              <w:t>8456</w:t>
+              <w:t>14483</w:t>
             </w:r>
           </w:p>
         </w:tc>
@@ -597,7 +597,7 @@
     </w:p>
     <w:p>
       <w:r>
-        <w:t>员工反馈集中认为：品牌宣传已从“锦上添花”变成增长抓手，但最大瓶颈不是品牌部不会做，而是“有枪缺子弹”——项目、技术、业务侧素材供给不足，社媒仍偏初级，视频与现场感内容偏少。对外口径需要统一并找到足够细分的“第一”心智，避免同质化空泛宣传；标杆项目、案例数据、客户价值故事、展会全周期运营被反复提及。同时，业务对展会筹备、客户接待、线索沉淀参与不够，客户/项目调研过度依赖品牌运营部前期信息。建议建立全公司素材供给与重点项目强制采集机制，品牌专业加工、业务共同转化，并专题化输出各类仓型与装车站等场景。</w:t>
+        <w:t>员工反馈集中认为：品牌宣传已从“锦上添花”变成增长抓手，但最大瓶颈不是品牌部不会做，而是“有枪缺子弹”——项目、技术、业务侧素材供给不足，社媒仍偏初级，视频与现场感内容偏少。对外口径需要统一并找到足够细分的“第一”心智，避免同质化空泛宣传；标杆项目、案例数据、客户价值故事、展会全周期运营被反复提及。同时，业务对展会筹备、客户接待、线索沉淀参与不够，客户/项目调研过度依赖品牌运营部前期信息。AI相关意见一并归口本部门：员工已提出较具体的落地场景，包括企业知识库（图纸/方案/制度/案例与多语检索）、翻译与标书初稿、会议纪要与办公提效、客户/商机调研与公海二次开发、项目风险预警与健康度看板、设计辅助与视觉质检等；落地原则多为买账号与培训、场景试点、AI辅助+人工终审，并强调商业秘密不上公网、先打通数据底座。建议建立全公司素材供给与重点项目强制采集机制，品牌专业加工、业务共同转化；同步牵头或协同推进AI培训、账号与重点场景试点。</w:t>
       </w:r>
     </w:p>
     <w:p>
@@ -605,7 +605,7 @@
         <w:pStyle w:val="Heading2"/>
       </w:pPr>
       <w:r>
-        <w:t>（二）员工反馈原文（共 58 条）</w:t>
+        <w:t>（二）员工反馈原文（共 115 条）</w:t>
       </w:r>
     </w:p>
     <w:p>
@@ -631,7 +631,25 @@
         <w:pStyle w:val="Heading3"/>
       </w:pPr>
       <w:r>
-        <w:t>2. 〔答卷#2 · Q1 品牌宣传 · 匿名〕</w:t>
+        <w:t>2. 〔答卷#1 · Q6 AI应用 · 匿名〕</w:t>
+      </w:r>
+    </w:p>
+    <w:p>
+      <w:r>
+        <w:t>对应题目：Q6 AI应用</w:t>
+      </w:r>
+    </w:p>
+    <w:p>
+      <w:r>
+        <w:t>1、AI 资料智能校对与归档，替代人工重复工作</w:t>
+      </w:r>
+    </w:p>
+    <w:p>
+      <w:pPr>
+        <w:pStyle w:val="Heading3"/>
+      </w:pPr>
+      <w:r>
+        <w:t>3. 〔答卷#2 · Q1 品牌宣传 · 匿名〕</w:t>
       </w:r>
     </w:p>
     <w:p>
@@ -649,7 +667,25 @@
         <w:pStyle w:val="Heading3"/>
       </w:pPr>
       <w:r>
-        <w:t>3. 〔答卷#3 · Q1 品牌宣传 · 匿名〕</w:t>
+        <w:t>4. 〔答卷#2 · Q6 AI应用 · 匿名〕</w:t>
+      </w:r>
+    </w:p>
+    <w:p>
+      <w:r>
+        <w:t>对应题目：Q6 AI应用</w:t>
+      </w:r>
+    </w:p>
+    <w:p>
+      <w:r>
+        <w:t>引进 AI 应用 在工程、技术、质量等方面运用，避免同类项目重复设计方案质量参差不齐的现象。</w:t>
+      </w:r>
+    </w:p>
+    <w:p>
+      <w:pPr>
+        <w:pStyle w:val="Heading3"/>
+      </w:pPr>
+      <w:r>
+        <w:t>5. 〔答卷#3 · Q1 品牌宣传 · 匿名〕</w:t>
       </w:r>
     </w:p>
     <w:p>
@@ -672,7 +708,7 @@
         <w:pStyle w:val="Heading3"/>
       </w:pPr>
       <w:r>
-        <w:t>4. 〔答卷#3 · Q6 AI应用 · 匿名〕</w:t>
+        <w:t>6. 〔答卷#3 · Q6 AI应用 · 匿名〕</w:t>
       </w:r>
     </w:p>
     <w:p>
@@ -705,7 +741,7 @@
         <w:pStyle w:val="Heading3"/>
       </w:pPr>
       <w:r>
-        <w:t>5. 〔答卷#4 · Q1 品牌宣传 · 匿名〕</w:t>
+        <w:t>7. 〔答卷#4 · Q1 品牌宣传 · 匿名〕</w:t>
       </w:r>
     </w:p>
     <w:p>
@@ -723,7 +759,25 @@
         <w:pStyle w:val="Heading3"/>
       </w:pPr>
       <w:r>
-        <w:t>6. 〔答卷#5 · Q1 品牌宣传 · 匿名〕</w:t>
+        <w:t>8. 〔答卷#4 · Q6 AI应用 · 匿名〕</w:t>
+      </w:r>
+    </w:p>
+    <w:p>
+      <w:r>
+        <w:t>对应题目：Q6 AI应用</w:t>
+      </w:r>
+    </w:p>
+    <w:p>
+      <w:r>
+        <w:t>对内借助AI提升投标、设计，施工管理效率，对外联合技术厂商集成AI智能监测，物料识别结构预警系统作为同舱成套解决方案，增值卖点，开拓高端项目与旧仓改造业务。</w:t>
+      </w:r>
+    </w:p>
+    <w:p>
+      <w:pPr>
+        <w:pStyle w:val="Heading3"/>
+      </w:pPr>
+      <w:r>
+        <w:t>9. 〔答卷#5 · Q1 品牌宣传 · 匿名〕</w:t>
       </w:r>
     </w:p>
     <w:p>
@@ -756,7 +810,30 @@
         <w:pStyle w:val="Heading3"/>
       </w:pPr>
       <w:r>
-        <w:t>7. 〔答卷#6 · Q1 品牌宣传 · 匿名〕</w:t>
+        <w:t>10. 〔答卷#5 · Q6 AI应用 · 匿名〕</w:t>
+      </w:r>
+    </w:p>
+    <w:p>
+      <w:r>
+        <w:t>对应题目：Q6 AI应用</w:t>
+      </w:r>
+    </w:p>
+    <w:p>
+      <w:r>
+        <w:t>1. 进度与任务管理：AI自动拆解项目目标、生成任务清单，依据历史数据预估工期；实时跟踪任务完成情况，识别延期风险、资源冲突，主动预警偏差。</w:t>
+      </w:r>
+    </w:p>
+    <w:p>
+      <w:r>
+        <w:t>2. 资源智能调配：分析人力、设备、预算使用数据，动态优化资源分配；识别闲置或过载资源，降低浪费，平衡团队工作负荷。</w:t>
+      </w:r>
+    </w:p>
+    <w:p>
+      <w:pPr>
+        <w:pStyle w:val="Heading3"/>
+      </w:pPr>
+      <w:r>
+        <w:t>11. 〔答卷#6 · Q1 品牌宣传 · 匿名〕</w:t>
       </w:r>
     </w:p>
     <w:p>
@@ -779,7 +856,35 @@
         <w:pStyle w:val="Heading3"/>
       </w:pPr>
       <w:r>
-        <w:t>8. 〔答卷#7 · Q1 品牌宣传 · 匿名〕</w:t>
+        <w:t>12. 〔答卷#6 · Q6 AI应用 · 匿名〕</w:t>
+      </w:r>
+    </w:p>
+    <w:p>
+      <w:r>
+        <w:t>对应题目：Q6 AI应用</w:t>
+      </w:r>
+    </w:p>
+    <w:p>
+      <w:r>
+        <w:t>（1）借助AI开发和管理客户。AI可以更好更快的编写开发信。AI可以更好更快的了解客户基本情况，</w:t>
+      </w:r>
+    </w:p>
+    <w:p>
+      <w:r>
+        <w:t>（2）借助AI搜索，可以在全国范围内寻找质优价廉、性价比高的供应商和劳务承包商。</w:t>
+      </w:r>
+    </w:p>
+    <w:p>
+      <w:r>
+        <w:t>（3）借助AI，可以优化设计方案，可以为研发和技术创新提供思路。</w:t>
+      </w:r>
+    </w:p>
+    <w:p>
+      <w:pPr>
+        <w:pStyle w:val="Heading3"/>
+      </w:pPr>
+      <w:r>
+        <w:t>13. 〔答卷#7 · Q1 品牌宣传 · 匿名〕</w:t>
       </w:r>
     </w:p>
     <w:p>
@@ -797,7 +902,30 @@
         <w:pStyle w:val="Heading3"/>
       </w:pPr>
       <w:r>
-        <w:t>9. 〔答卷#8 · Q1 品牌宣传 · 匿名〕</w:t>
+        <w:t>14. 〔答卷#7 · Q6 AI应用 · 匿名〕</w:t>
+      </w:r>
+    </w:p>
+    <w:p>
+      <w:r>
+        <w:t>对应题目：Q6 AI应用</w:t>
+      </w:r>
+    </w:p>
+    <w:p>
+      <w:r>
+        <w:t>1. 相关现场/技术问题处理时，可采用AI进行分析和建议解决方案，过程中引用的资料可重点关注</w:t>
+      </w:r>
+    </w:p>
+    <w:p>
+      <w:r>
+        <w:t>2. 可考虑相关设计工作引入AI，解决部分基础性设计工作。</w:t>
+      </w:r>
+    </w:p>
+    <w:p>
+      <w:pPr>
+        <w:pStyle w:val="Heading3"/>
+      </w:pPr>
+      <w:r>
+        <w:t>15. 〔答卷#8 · Q1 品牌宣传 · 匿名〕</w:t>
       </w:r>
     </w:p>
     <w:p>
@@ -815,7 +943,43 @@
         <w:pStyle w:val="Heading3"/>
       </w:pPr>
       <w:r>
-        <w:t>10. 〔答卷#9 · Q1 品牌宣传 · 匿名〕</w:t>
+        <w:t>16. 〔答卷#8 · Q2 产品与赛道定位 · 匿名〕</w:t>
+      </w:r>
+    </w:p>
+    <w:p>
+      <w:r>
+        <w:t>对应题目：Q2 产品与赛道定位</w:t>
+      </w:r>
+    </w:p>
+    <w:p>
+      <w:r>
+        <w:t>筒仓的智能管理如何有效的与 AI 进行搭接并真正的实现智能化，需要真的有人去研究，而不是停留在口号上我们要利用 AI</w:t>
+      </w:r>
+    </w:p>
+    <w:p>
+      <w:pPr>
+        <w:pStyle w:val="Heading3"/>
+      </w:pPr>
+      <w:r>
+        <w:t>17. 〔答卷#8 · Q6 AI应用 · 匿名〕</w:t>
+      </w:r>
+    </w:p>
+    <w:p>
+      <w:r>
+        <w:t>对应题目：Q6 AI应用</w:t>
+      </w:r>
+    </w:p>
+    <w:p>
+      <w:r>
+        <w:t>无</w:t>
+      </w:r>
+    </w:p>
+    <w:p>
+      <w:pPr>
+        <w:pStyle w:val="Heading3"/>
+      </w:pPr>
+      <w:r>
+        <w:t>18. 〔答卷#9 · Q1 品牌宣传 · 匿名〕</w:t>
       </w:r>
     </w:p>
     <w:p>
@@ -848,7 +1012,50 @@
         <w:pStyle w:val="Heading3"/>
       </w:pPr>
       <w:r>
-        <w:t>11. 〔答卷#10 · Q1 品牌宣传 · 匿名〕</w:t>
+        <w:t>19. 〔答卷#9 · Q6 AI应用 · 匿名〕</w:t>
+      </w:r>
+    </w:p>
+    <w:p>
+      <w:r>
+        <w:t>对应题目：Q6 AI应用</w:t>
+      </w:r>
+    </w:p>
+    <w:p>
+      <w:r>
+        <w:t>我认为 ai 能更好的提高工作的效率</w:t>
+      </w:r>
+    </w:p>
+    <w:p>
+      <w:r>
+        <w:t>1. 关于 epc 项目涉及大量技术文件，合同标准规范需要翻译。建立专属的“技术文档翻译知识库”，训练行业术语模型，实现技术文件、合同、标书的 AI 预翻译+人工复核，降低翻译成本和时间</w:t>
+      </w:r>
+    </w:p>
+    <w:p>
+      <w:r>
+        <w:t>2. AI 辅助标准合规性检查：输入设计方案关键参数，自动比对俄标/欧标要求，标注潜在不符合项</w:t>
+      </w:r>
+    </w:p>
+    <w:p>
+      <w:r>
+        <w:t>3. 建立“项目协同智能体”，打通设计图纸、采购订单、物流状态、施工进度等系统数据，自动生成项目健康度看板</w:t>
+      </w:r>
+    </w:p>
+    <w:p>
+      <w:r>
+        <w:t>AI 自动识别项目风险（如采购延期、物流滞留、施工偏差），提前预警并建议应对方案</w:t>
+      </w:r>
+    </w:p>
+    <w:p>
+      <w:r>
+        <w:t>4. 跨部门任务自动分配与跟进，减少“催进度、等回复”的时间消耗</w:t>
+      </w:r>
+    </w:p>
+    <w:p>
+      <w:pPr>
+        <w:pStyle w:val="Heading3"/>
+      </w:pPr>
+      <w:r>
+        <w:t>20. 〔答卷#10 · Q1 品牌宣传 · 匿名〕</w:t>
       </w:r>
     </w:p>
     <w:p>
@@ -871,7 +1078,42 @@
         <w:pStyle w:val="Heading3"/>
       </w:pPr>
       <w:r>
-        <w:t>12. 〔答卷#11 · Q1 品牌宣传 · 匿名〕</w:t>
+        <w:t>21. 〔答卷#10 · Q6 AI应用 · 匿名〕</w:t>
+      </w:r>
+    </w:p>
+    <w:p>
+      <w:r>
+        <w:t>对应题目：Q6 AI应用</w:t>
+      </w:r>
+    </w:p>
+    <w:p>
+      <w:r>
+        <w:t>我认为 AI 是当前投入产出比最高、最容易见效的管理提升手段之一，建议公司认真对待。优先应用场景和建议如下：</w:t>
+      </w:r>
+    </w:p>
+    <w:p>
+      <w:r>
+        <w:t>一是建议公司购买一批 AI 账号/Token 额度，开放给各部门用于办公自动化——文件翻译、资料整理、方案初稿、报价文件排版、市场调研等日常工作，很多流程完全可以自动化跑通，能直接释放大量人力；</w:t>
+      </w:r>
+    </w:p>
+    <w:p/>
+    <w:p>
+      <w:r>
+        <w:t>二是目前智能体（Agent）技术已经比较成熟，许多在电脑上完成的重复性工作，智能体已经可以自动化执行，公司只需购买相应额度即可落地，建议先在一两个部门试点，跑出效果后再推广；</w:t>
+      </w:r>
+    </w:p>
+    <w:p/>
+    <w:p>
+      <w:r>
+        <w:t>三是建议指定专人或小组负责收集各部门的 AI 使用场景和最佳实践，定期分享，避免各自摸索、重复踩坑。</w:t>
+      </w:r>
+    </w:p>
+    <w:p>
+      <w:pPr>
+        <w:pStyle w:val="Heading3"/>
+      </w:pPr>
+      <w:r>
+        <w:t>22. 〔答卷#11 · Q1 品牌宣传 · 匿名〕</w:t>
       </w:r>
     </w:p>
     <w:p>
@@ -889,7 +1131,25 @@
         <w:pStyle w:val="Heading3"/>
       </w:pPr>
       <w:r>
-        <w:t>13. 〔答卷#12 · Q1 品牌宣传 · 匿名〕</w:t>
+        <w:t>23. 〔答卷#11 · Q6 AI应用 · 匿名〕</w:t>
+      </w:r>
+    </w:p>
+    <w:p>
+      <w:r>
+        <w:t>对应题目：Q6 AI应用</w:t>
+      </w:r>
+    </w:p>
+    <w:p>
+      <w:r>
+        <w:t>无</w:t>
+      </w:r>
+    </w:p>
+    <w:p>
+      <w:pPr>
+        <w:pStyle w:val="Heading3"/>
+      </w:pPr>
+      <w:r>
+        <w:t>24. 〔答卷#12 · Q1 品牌宣传 · 匿名〕</w:t>
       </w:r>
     </w:p>
     <w:p>
@@ -907,7 +1167,25 @@
         <w:pStyle w:val="Heading3"/>
       </w:pPr>
       <w:r>
-        <w:t>14. 〔答卷#13 · Q1 品牌宣传 · 匿名〕</w:t>
+        <w:t>25. 〔答卷#12 · Q6 AI应用 · 匿名〕</w:t>
+      </w:r>
+    </w:p>
+    <w:p>
+      <w:r>
+        <w:t>对应题目：Q6 AI应用</w:t>
+      </w:r>
+    </w:p>
+    <w:p>
+      <w:r>
+        <w:t>AI 目前就是公司调研和可行性方案可以给与一些参考意见。</w:t>
+      </w:r>
+    </w:p>
+    <w:p>
+      <w:pPr>
+        <w:pStyle w:val="Heading3"/>
+      </w:pPr>
+      <w:r>
+        <w:t>26. 〔答卷#13 · Q1 品牌宣传 · 匿名〕</w:t>
       </w:r>
     </w:p>
     <w:p>
@@ -960,7 +1238,55 @@
         <w:pStyle w:val="Heading3"/>
       </w:pPr>
       <w:r>
-        <w:t>15. 〔答卷#13 · Q8 工作效率与状态 · 匿名〕</w:t>
+        <w:t>27. 〔答卷#13 · Q6 AI应用 · 匿名〕</w:t>
+      </w:r>
+    </w:p>
+    <w:p>
+      <w:r>
+        <w:t>对应题目：Q6 AI应用</w:t>
+      </w:r>
+    </w:p>
+    <w:p>
+      <w:r>
+        <w:t>我认为，目前实荣已经属于全员会主动借助 AI 完成工作，但是目前 AI 可能很多员工还是停留在借助 AI 搜索资料，整理信息的作用，但是目前 AI 其实已经可以半自动化或自动化去处理一些基础工作，所以建议通过一些机制，提高大家对于 AI 的使用：</w:t>
+      </w:r>
+    </w:p>
+    <w:p>
+      <w:r>
+        <w:t>第一，建立公司 AI 培训机制</w:t>
+      </w:r>
+    </w:p>
+    <w:p>
+      <w:r>
+        <w:t>将 AI 能力纳入员工培训体系，链接外部 AI 培训资源，针对不同岗位制定 AI 应用课程，让 AI 成为基础工作能力，比如目前很火的办公台创建，而不是单纯的用 AI 搜索资料，而现在比较火的 TRAE WORK 可以自动处理一些工作；</w:t>
+      </w:r>
+    </w:p>
+    <w:p>
+      <w:r>
+        <w:t>第二，成立 AI 应用创新小组</w:t>
+      </w:r>
+    </w:p>
+    <w:p>
+      <w:r>
+        <w:t>由各部门选拔 AI 应用积极人员，探索岗位自动化场景，形成公司内部 AI 应用案例库。比如目前市场战略部通过调研发现大量的有效客户信息被丢进公海，是否可以联合新员工对于公海客户二次开发，以创新小组形式通过 AI 的助力，挖掘有效线索并推进工作；</w:t>
+      </w:r>
+    </w:p>
+    <w:p>
+      <w:r>
+        <w:t>第三，鼓励“AI+岗位创新”</w:t>
+      </w:r>
+    </w:p>
+    <w:p>
+      <w:r>
+        <w:t>不要限定 AI 只能用于某些业务，而是鼓励每个岗位思考：“我的工作哪些环节可以被 AI 优化？”建议公司可以对于员工进行 AI 工作创新的支持以及费用的报销，比如现在大量 AI 需要会员，或者流量费用，建议可以给出一部分经费支持大家创新工作模式，探讨如何更高效借助 AI 完成工作。</w:t>
+      </w:r>
+    </w:p>
+    <w:p>
+      <w:pPr>
+        <w:pStyle w:val="Heading3"/>
+      </w:pPr>
+      <w:r>
+        <w:t>28. 〔答卷#13 · Q8 工作效率与状态 · 匿名〕</w:t>
       </w:r>
     </w:p>
     <w:p>
@@ -1115,7 +1441,7 @@
         <w:pStyle w:val="Heading3"/>
       </w:pPr>
       <w:r>
-        <w:t>16. 〔答卷#15 · Q1 品牌宣传 · 匿名〕</w:t>
+        <w:t>29. 〔答卷#15 · Q1 品牌宣传 · 匿名〕</w:t>
       </w:r>
     </w:p>
     <w:p>
@@ -1133,7 +1459,40 @@
         <w:pStyle w:val="Heading3"/>
       </w:pPr>
       <w:r>
-        <w:t>17. 〔答卷#16 · Q1 品牌宣传 · 匿名〕</w:t>
+        <w:t>30. 〔答卷#15 · Q6 AI应用 · 匿名〕</w:t>
+      </w:r>
+    </w:p>
+    <w:p>
+      <w:r>
+        <w:t>对应题目：Q6 AI应用</w:t>
+      </w:r>
+    </w:p>
+    <w:p>
+      <w:r>
+        <w:t>1. 企业知识库建设，将项目经验、技术资料、制度文件进行智能化管理；</w:t>
+      </w:r>
+    </w:p>
+    <w:p>
+      <w:r>
+        <w:t>2. 辅助合同、方案、报告等文件生成和审核；</w:t>
+      </w:r>
+    </w:p>
+    <w:p>
+      <w:r>
+        <w:t>3. 数据分析和经营管理辅助决策。</w:t>
+      </w:r>
+    </w:p>
+    <w:p>
+      <w:r>
+        <w:t>4. 建议逐步推进AI应用，与实际业务场景结合，避免工具化应用。</w:t>
+      </w:r>
+    </w:p>
+    <w:p>
+      <w:pPr>
+        <w:pStyle w:val="Heading3"/>
+      </w:pPr>
+      <w:r>
+        <w:t>31. 〔答卷#16 · Q1 品牌宣传 · 匿名〕</w:t>
       </w:r>
     </w:p>
     <w:p>
@@ -1151,7 +1510,73 @@
         <w:pStyle w:val="Heading3"/>
       </w:pPr>
       <w:r>
-        <w:t>18. 〔答卷#17 · Q1 品牌宣传 · 匿名〕</w:t>
+        <w:t>32. 〔答卷#16 · Q3 公司核心竞争力 · 匿名〕</w:t>
+      </w:r>
+    </w:p>
+    <w:p>
+      <w:r>
+        <w:t>对应题目：Q3 公司核心竞争力</w:t>
+      </w:r>
+    </w:p>
+    <w:p>
+      <w:r>
+        <w:t>建议持续强化设计、制造、施工一体化能力，充分发挥现有数字化管理平台的价值，加强数据共享和业务协同。</w:t>
+      </w:r>
+    </w:p>
+    <w:p/>
+    <w:p>
+      <w:r>
+        <w:t>同时推动 AI 与数字化平台结合，提高知识沉淀、项目管理和跨部门协作效率，进一步提升客户响应速度和服务质量。</w:t>
+      </w:r>
+    </w:p>
+    <w:p>
+      <w:pPr>
+        <w:pStyle w:val="Heading3"/>
+      </w:pPr>
+      <w:r>
+        <w:t>33. 〔答卷#16 · Q6 AI应用 · 匿名〕</w:t>
+      </w:r>
+    </w:p>
+    <w:p>
+      <w:r>
+        <w:t>对应题目：Q6 AI应用</w:t>
+      </w:r>
+    </w:p>
+    <w:p>
+      <w:r>
+        <w:t>建议在现有数字化管理平台基础上，进一步引入成熟的大模型工具作为员工办公助手。建议配置如 GPT Plus 或 Claude 账号企业版，根据岗位需求供各部门使用。</w:t>
+      </w:r>
+    </w:p>
+    <w:p/>
+    <w:p>
+      <w:r>
+        <w:t>同时建议开展 AI 应用培训，并制定基础使用规范，充分发挥 AI 在提高工作效率、减少重复劳动、提升工作质量等方面的价值。</w:t>
+      </w:r>
+    </w:p>
+    <w:p>
+      <w:pPr>
+        <w:pStyle w:val="Heading3"/>
+      </w:pPr>
+      <w:r>
+        <w:t>34. 〔答卷#16 · Q10 开放题 · 匿名〕</w:t>
+      </w:r>
+    </w:p>
+    <w:p>
+      <w:r>
+        <w:t>对应题目：Q10 开放题</w:t>
+      </w:r>
+    </w:p>
+    <w:p>
+      <w:r>
+        <w:t>建议持续关注员工成长与职业发展，完善培训体系和晋升通道，让员工能够看到长期发展的机会。同时，希望公司能够持续关注数字化建设和 AI 应用，不断提升管理效率和企业竞争力，为公司未来发展奠定更好的基础。</w:t>
+      </w:r>
+    </w:p>
+    <w:p>
+      <w:pPr>
+        <w:pStyle w:val="Heading3"/>
+      </w:pPr>
+      <w:r>
+        <w:t>35. 〔答卷#17 · Q1 品牌宣传 · 匿名〕</w:t>
       </w:r>
     </w:p>
     <w:p>
@@ -1169,7 +1594,25 @@
         <w:pStyle w:val="Heading3"/>
       </w:pPr>
       <w:r>
-        <w:t>19. 〔答卷#18 · Q1 品牌宣传 · 匿名〕</w:t>
+        <w:t>36. 〔答卷#17 · Q6 AI应用 · 匿名〕</w:t>
+      </w:r>
+    </w:p>
+    <w:p>
+      <w:r>
+        <w:t>对应题目：Q6 AI应用</w:t>
+      </w:r>
+    </w:p>
+    <w:p>
+      <w:r>
+        <w:t>无</w:t>
+      </w:r>
+    </w:p>
+    <w:p>
+      <w:pPr>
+        <w:pStyle w:val="Heading3"/>
+      </w:pPr>
+      <w:r>
+        <w:t>37. 〔答卷#18 · Q1 品牌宣传 · 匿名〕</w:t>
       </w:r>
     </w:p>
     <w:p>
@@ -1192,7 +1635,25 @@
         <w:pStyle w:val="Heading3"/>
       </w:pPr>
       <w:r>
-        <w:t>20. 〔答卷#19 · Q1 品牌宣传 · 匿名〕</w:t>
+        <w:t>38. 〔答卷#18 · Q6 AI应用 · 匿名〕</w:t>
+      </w:r>
+    </w:p>
+    <w:p>
+      <w:r>
+        <w:t>对应题目：Q6 AI应用</w:t>
+      </w:r>
+    </w:p>
+    <w:p>
+      <w:r>
+        <w:t>AI很好服务公司，在引擎搜索、翻译、设计、排版等方面都有很大优势</w:t>
+      </w:r>
+    </w:p>
+    <w:p>
+      <w:pPr>
+        <w:pStyle w:val="Heading3"/>
+      </w:pPr>
+      <w:r>
+        <w:t>39. 〔答卷#19 · Q1 品牌宣传 · 匿名〕</w:t>
       </w:r>
     </w:p>
     <w:p>
@@ -1215,7 +1676,7 @@
         <w:pStyle w:val="Heading3"/>
       </w:pPr>
       <w:r>
-        <w:t>21. 〔答卷#19 · Q4 项目打单 · 匿名〕</w:t>
+        <w:t>40. 〔答卷#19 · Q4 项目打单 · 匿名〕</w:t>
       </w:r>
     </w:p>
     <w:p>
@@ -1253,7 +1714,30 @@
         <w:pStyle w:val="Heading3"/>
       </w:pPr>
       <w:r>
-        <w:t>22. 〔答卷#20 · Q1 品牌宣传 · 匿名〕</w:t>
+        <w:t>41. 〔答卷#19 · Q6 AI应用 · 匿名〕</w:t>
+      </w:r>
+    </w:p>
+    <w:p>
+      <w:r>
+        <w:t>对应题目：Q6 AI应用</w:t>
+      </w:r>
+    </w:p>
+    <w:p>
+      <w:r>
+        <w:t>（1）AI调研客户：但人工核实仍是必不可少的。ai为了呈现近乎完美的结果，有时撒谎；</w:t>
+      </w:r>
+    </w:p>
+    <w:p>
+      <w:r>
+        <w:t>（2）AI制作宣传图纸及视频：同样也需人工纠偏。</w:t>
+      </w:r>
+    </w:p>
+    <w:p>
+      <w:pPr>
+        <w:pStyle w:val="Heading3"/>
+      </w:pPr>
+      <w:r>
+        <w:t>42. 〔答卷#20 · Q1 品牌宣传 · 匿名〕</w:t>
       </w:r>
     </w:p>
     <w:p>
@@ -1271,7 +1755,25 @@
         <w:pStyle w:val="Heading3"/>
       </w:pPr>
       <w:r>
-        <w:t>23. 〔答卷#21 · Q1 品牌宣传 · 匿名〕</w:t>
+        <w:t>43. 〔答卷#20 · Q6 AI应用 · 匿名〕</w:t>
+      </w:r>
+    </w:p>
+    <w:p>
+      <w:r>
+        <w:t>对应题目：Q6 AI应用</w:t>
+      </w:r>
+    </w:p>
+    <w:p>
+      <w:r>
+        <w:t>无</w:t>
+      </w:r>
+    </w:p>
+    <w:p>
+      <w:pPr>
+        <w:pStyle w:val="Heading3"/>
+      </w:pPr>
+      <w:r>
+        <w:t>44. 〔答卷#21 · Q1 品牌宣传 · 匿名〕</w:t>
       </w:r>
     </w:p>
     <w:p>
@@ -1294,7 +1796,35 @@
         <w:pStyle w:val="Heading3"/>
       </w:pPr>
       <w:r>
-        <w:t>24. 〔答卷#22 · Q1 品牌宣传 · 匿名〕</w:t>
+        <w:t>45. 〔答卷#21 · Q6 AI应用 · 匿名〕</w:t>
+      </w:r>
+    </w:p>
+    <w:p>
+      <w:r>
+        <w:t>对应题目：Q6 AI应用</w:t>
+      </w:r>
+    </w:p>
+    <w:p>
+      <w:r>
+        <w:t>明确人机决策权限分工，界定哪些决策可由AI自主执行、哪些必须由人最终确认；</w:t>
+      </w:r>
+    </w:p>
+    <w:p>
+      <w:r>
+        <w:t>建立AI应用的审计与追溯机制，确保每一个AI决策都能被溯源、被问责；</w:t>
+      </w:r>
+    </w:p>
+    <w:p>
+      <w:r>
+        <w:t>将AI应用纳入公司治理体系，明确高管对AI应用的风险负责制，摒弃“技术问题交由技术部门全权负责”的错误认知。</w:t>
+      </w:r>
+    </w:p>
+    <w:p>
+      <w:pPr>
+        <w:pStyle w:val="Heading3"/>
+      </w:pPr>
+      <w:r>
+        <w:t>46. 〔答卷#22 · Q1 品牌宣传 · 匿名〕</w:t>
       </w:r>
     </w:p>
     <w:p>
@@ -1318,7 +1848,25 @@
         <w:pStyle w:val="Heading3"/>
       </w:pPr>
       <w:r>
-        <w:t>25. 〔答卷#23 · Q1 品牌宣传 · 匿名〕</w:t>
+        <w:t>47. 〔答卷#22 · Q6 AI应用 · 匿名〕</w:t>
+      </w:r>
+    </w:p>
+    <w:p>
+      <w:r>
+        <w:t>对应题目：Q6 AI应用</w:t>
+      </w:r>
+    </w:p>
+    <w:p>
+      <w:r>
+        <w:t>无</w:t>
+      </w:r>
+    </w:p>
+    <w:p>
+      <w:pPr>
+        <w:pStyle w:val="Heading3"/>
+      </w:pPr>
+      <w:r>
+        <w:t>48. 〔答卷#23 · Q1 品牌宣传 · 匿名〕</w:t>
       </w:r>
     </w:p>
     <w:p>
@@ -1336,7 +1884,25 @@
         <w:pStyle w:val="Heading3"/>
       </w:pPr>
       <w:r>
-        <w:t>26. 〔答卷#24 · Q1 品牌宣传 · 匿名〕</w:t>
+        <w:t>49. 〔答卷#23 · Q6 AI应用 · 匿名〕</w:t>
+      </w:r>
+    </w:p>
+    <w:p>
+      <w:r>
+        <w:t>对应题目：Q6 AI应用</w:t>
+      </w:r>
+    </w:p>
+    <w:p>
+      <w:r>
+        <w:t>无</w:t>
+      </w:r>
+    </w:p>
+    <w:p>
+      <w:pPr>
+        <w:pStyle w:val="Heading3"/>
+      </w:pPr>
+      <w:r>
+        <w:t>50. 〔答卷#24 · Q1 品牌宣传 · 匿名〕</w:t>
       </w:r>
     </w:p>
     <w:p>
@@ -1354,7 +1920,25 @@
         <w:pStyle w:val="Heading3"/>
       </w:pPr>
       <w:r>
-        <w:t>27. 〔答卷#25 · Q1 品牌宣传 · 匿名〕</w:t>
+        <w:t>51. 〔答卷#24 · Q6 AI应用 · 匿名〕</w:t>
+      </w:r>
+    </w:p>
+    <w:p>
+      <w:r>
+        <w:t>对应题目：Q6 AI应用</w:t>
+      </w:r>
+    </w:p>
+    <w:p>
+      <w:r>
+        <w:t>可以帮助我们写一些施工方案、管理文件等</w:t>
+      </w:r>
+    </w:p>
+    <w:p>
+      <w:pPr>
+        <w:pStyle w:val="Heading3"/>
+      </w:pPr>
+      <w:r>
+        <w:t>52. 〔答卷#25 · Q1 品牌宣传 · 匿名〕</w:t>
       </w:r>
     </w:p>
     <w:p>
@@ -1372,7 +1956,25 @@
         <w:pStyle w:val="Heading3"/>
       </w:pPr>
       <w:r>
-        <w:t>28. 〔答卷#26 · Q1 品牌宣传 · 匿名〕</w:t>
+        <w:t>53. 〔答卷#25 · Q6 AI应用 · 匿名〕</w:t>
+      </w:r>
+    </w:p>
+    <w:p>
+      <w:r>
+        <w:t>对应题目：Q6 AI应用</w:t>
+      </w:r>
+    </w:p>
+    <w:p>
+      <w:r>
+        <w:t>可以考虑成立AI部门，请相关专业人事就公司业务范围做出图纸设计、采购等方面可以用AI代替人员。</w:t>
+      </w:r>
+    </w:p>
+    <w:p>
+      <w:pPr>
+        <w:pStyle w:val="Heading3"/>
+      </w:pPr>
+      <w:r>
+        <w:t>54. 〔答卷#26 · Q1 品牌宣传 · 匿名〕</w:t>
       </w:r>
     </w:p>
     <w:p>
@@ -1400,7 +2002,25 @@
         <w:pStyle w:val="Heading3"/>
       </w:pPr>
       <w:r>
-        <w:t>29. 〔答卷#27 · Q1 品牌宣传 · 匿名〕</w:t>
+        <w:t>55. 〔答卷#26 · Q6 AI应用 · 匿名〕</w:t>
+      </w:r>
+    </w:p>
+    <w:p>
+      <w:r>
+        <w:t>对应题目：Q6 AI应用</w:t>
+      </w:r>
+    </w:p>
+    <w:p>
+      <w:r>
+        <w:t>建议：搭建公司内部知识库，利用 AI 实现历史项目图纸说明、技术方案、答疑资料智能检索、文本改写、中英双语互译，优先服务海外筒仓项目标书与计算书编制。</w:t>
+      </w:r>
+    </w:p>
+    <w:p>
+      <w:pPr>
+        <w:pStyle w:val="Heading3"/>
+      </w:pPr>
+      <w:r>
+        <w:t>56. 〔答卷#27 · Q1 品牌宣传 · 匿名〕</w:t>
       </w:r>
     </w:p>
     <w:p>
@@ -1468,7 +2088,7 @@
         <w:pStyle w:val="Heading3"/>
       </w:pPr>
       <w:r>
-        <w:t>30. 〔答卷#27 · Q4 项目打单 · 匿名〕</w:t>
+        <w:t>57. 〔答卷#27 · Q4 项目打单 · 匿名〕</w:t>
       </w:r>
     </w:p>
     <w:p>
@@ -1577,7 +2197,115 @@
         <w:pStyle w:val="Heading3"/>
       </w:pPr>
       <w:r>
-        <w:t>31. 〔答卷#29 · Q1 品牌宣传 · 匿名〕</w:t>
+        <w:t>58. 〔答卷#27 · Q6 AI应用 · 匿名〕</w:t>
+      </w:r>
+    </w:p>
+    <w:p>
+      <w:r>
+        <w:t>对应题目：Q6 AI应用</w:t>
+      </w:r>
+    </w:p>
+    <w:p>
+      <w:r>
+        <w:t>AI应用的核心，是提高工作效率、拓宽信息来源，并帮助员工完善工作方法、优化业务流程。各部门都应结合各部门工作内容，寻找适合使用AI提效的具体场景。</w:t>
+      </w:r>
+    </w:p>
+    <w:p>
+      <w:r>
+        <w:t>优先应用场景：</w:t>
+      </w:r>
+    </w:p>
+    <w:p>
+      <w:r>
+        <w:t>1. 全球商机及项目信息搜索</w:t>
+      </w:r>
+    </w:p>
+    <w:p>
+      <w:r>
+        <w:t>2. 询盘和项目需求分析</w:t>
+      </w:r>
+    </w:p>
+    <w:p>
+      <w:r>
+        <w:t>3. 客户背景调查与真实性判断</w:t>
+      </w:r>
+    </w:p>
+    <w:p>
+      <w:r>
+        <w:t>4. 公海客户筛选及二次开发</w:t>
+      </w:r>
+    </w:p>
+    <w:p>
+      <w:r>
+        <w:t>5. 竞争对手和市场分析</w:t>
+      </w:r>
+    </w:p>
+    <w:p>
+      <w:r>
+        <w:t>6. 合同、投标文件辅助审核</w:t>
+      </w:r>
+    </w:p>
+    <w:p>
+      <w:r>
+        <w:t>7. 网站技术文章选题、内容输出及SEO优化</w:t>
+      </w:r>
+    </w:p>
+    <w:p>
+      <w:r>
+        <w:t>8. 宣传图片生成、修改和设计辅助</w:t>
+      </w:r>
+    </w:p>
+    <w:p>
+      <w:r>
+        <w:t>主要解决的管理痛点：</w:t>
+      </w:r>
+    </w:p>
+    <w:p>
+      <w:r>
+        <w:t>减少重复性工作和人工信息搜集时间，提高信息分析、内容生产及决策效率；同时沉淀工作流程和部门经验，降低工作对个人能力与经验的过度依赖。</w:t>
+      </w:r>
+    </w:p>
+    <w:p>
+      <w:r>
+        <w:t>落地建议：</w:t>
+      </w:r>
+    </w:p>
+    <w:p>
+      <w:r>
+        <w:t>1. 积极学习并合理投入</w:t>
+      </w:r>
+    </w:p>
+    <w:p>
+      <w:r>
+        <w:t>AI是长期发展趋势，应主动学习和应用，不能抵触和排斥。公司可选择重点岗位和场景进行试点，并配置必要的付费工具，因为免费版本与专业付费版本在能力和效率上存在较大差距。</w:t>
+      </w:r>
+    </w:p>
+    <w:p>
+      <w:r>
+        <w:t>2. 坚持人工主导和最终审核</w:t>
+      </w:r>
+    </w:p>
+    <w:p>
+      <w:r>
+        <w:t>使用AI前，员工应明确工作目标、基本流程和判断标准，再由AI进行补充、优化和提效。不能完全依赖AI规划工作，最终结果必须由专业人员审核、验证并作出决策。</w:t>
+      </w:r>
+    </w:p>
+    <w:p>
+      <w:r>
+        <w:t>3. 沉淀流程并建立备选方案</w:t>
+      </w:r>
+    </w:p>
+    <w:p>
+      <w:r>
+        <w:t>各部门应将成熟的提示词、工作流程、模板和案例进行沉淀，形成可迁移的AI工作流。同时考虑国外AI工具在使用稳定性、数据安全和访问方面的限制，建立国内外AI工具相互补充的备选方案，避免对单一平台形成依赖。</w:t>
+      </w:r>
+    </w:p>
+    <w:p>
+      <w:pPr>
+        <w:pStyle w:val="Heading3"/>
+      </w:pPr>
+      <w:r>
+        <w:t>59. 〔答卷#29 · Q1 品牌宣传 · 匿名〕</w:t>
       </w:r>
     </w:p>
     <w:p>
@@ -1595,7 +2323,25 @@
         <w:pStyle w:val="Heading3"/>
       </w:pPr>
       <w:r>
-        <w:t>32. 〔答卷#30 · Q1 品牌宣传 · 匿名〕</w:t>
+        <w:t>60. 〔答卷#29 · Q6 AI应用 · 匿名〕</w:t>
+      </w:r>
+    </w:p>
+    <w:p>
+      <w:r>
+        <w:t>对应题目：Q6 AI应用</w:t>
+      </w:r>
+    </w:p>
+    <w:p>
+      <w:r>
+        <w:t>目前AI 大多需求集中在文案，作图和视频剪辑方面：报价，社媒文案，回执信等文案简单都能处理。但作图和视频剪辑方面因素材和相关人员的配置需求就相对较大，且需要不停修改，免费额度就不足以支撑了，可以集中注册充值一些供员工使用的AI会员账号，方便工作使用。</w:t>
+      </w:r>
+    </w:p>
+    <w:p>
+      <w:pPr>
+        <w:pStyle w:val="Heading3"/>
+      </w:pPr>
+      <w:r>
+        <w:t>61. 〔答卷#30 · Q1 品牌宣传 · 匿名〕</w:t>
       </w:r>
     </w:p>
     <w:p>
@@ -1618,7 +2364,25 @@
         <w:pStyle w:val="Heading3"/>
       </w:pPr>
       <w:r>
-        <w:t>33. 〔答卷#31 · Q1 品牌宣传 · 匿名〕</w:t>
+        <w:t>62. 〔答卷#30 · Q6 AI应用 · 匿名〕</w:t>
+      </w:r>
+    </w:p>
+    <w:p>
+      <w:r>
+        <w:t>对应题目：Q6 AI应用</w:t>
+      </w:r>
+    </w:p>
+    <w:p>
+      <w:r>
+        <w:t>建议公司有公开的AI账号，给予各部门使用，充好会员，赋能大家。</w:t>
+      </w:r>
+    </w:p>
+    <w:p>
+      <w:pPr>
+        <w:pStyle w:val="Heading3"/>
+      </w:pPr>
+      <w:r>
+        <w:t>63. 〔答卷#31 · Q1 品牌宣传 · 匿名〕</w:t>
       </w:r>
     </w:p>
     <w:p>
@@ -1656,7 +2420,25 @@
         <w:pStyle w:val="Heading3"/>
       </w:pPr>
       <w:r>
-        <w:t>34. 〔答卷#32 · Q1 品牌宣传 · 匿名〕</w:t>
+        <w:t>64. 〔答卷#31 · Q6 AI应用 · 匿名〕</w:t>
+      </w:r>
+    </w:p>
+    <w:p>
+      <w:r>
+        <w:t>对应题目：Q6 AI应用</w:t>
+      </w:r>
+    </w:p>
+    <w:p>
+      <w:r>
+        <w:t>建立 AI 助手，将公司的管理制度已经日常事务性工作输入，如新同事入职后对于公司基础信息不了解，如该如何打卡、出差车票和机票该如何预订、公司的差旅标准、公司打印机如何连接、用车流程如何提交，信息输入后，即可对公司基础性事务有所了解，减少管理人员重复性事项处理。</w:t>
+      </w:r>
+    </w:p>
+    <w:p>
+      <w:pPr>
+        <w:pStyle w:val="Heading3"/>
+      </w:pPr>
+      <w:r>
+        <w:t>65. 〔答卷#32 · Q1 品牌宣传 · 匿名〕</w:t>
       </w:r>
     </w:p>
     <w:p>
@@ -1674,7 +2456,25 @@
         <w:pStyle w:val="Heading3"/>
       </w:pPr>
       <w:r>
-        <w:t>35. 〔答卷#33 · Q1 品牌宣传 · 匿名〕</w:t>
+        <w:t>66. 〔答卷#32 · Q6 AI应用 · 匿名〕</w:t>
+      </w:r>
+    </w:p>
+    <w:p>
+      <w:r>
+        <w:t>对应题目：Q6 AI应用</w:t>
+      </w:r>
+    </w:p>
+    <w:p>
+      <w:r>
+        <w:t>无</w:t>
+      </w:r>
+    </w:p>
+    <w:p>
+      <w:pPr>
+        <w:pStyle w:val="Heading3"/>
+      </w:pPr>
+      <w:r>
+        <w:t>67. 〔答卷#33 · Q1 品牌宣传 · 匿名〕</w:t>
       </w:r>
     </w:p>
     <w:p>
@@ -1692,7 +2492,25 @@
         <w:pStyle w:val="Heading3"/>
       </w:pPr>
       <w:r>
-        <w:t>36. 〔答卷#34 · Q1 品牌宣传 · 匿名〕</w:t>
+        <w:t>68. 〔答卷#33 · Q6 AI应用 · 匿名〕</w:t>
+      </w:r>
+    </w:p>
+    <w:p>
+      <w:r>
+        <w:t>对应题目：Q6 AI应用</w:t>
+      </w:r>
+    </w:p>
+    <w:p>
+      <w:r>
+        <w:t>将 AI应用于内部的绩效管理分析。将部门及岗位工作职责、每天日报完成内容及完成度等信息，投喂给Al，辅助进行绩效打分，以此作为月度绩效的衡量标准。</w:t>
+      </w:r>
+    </w:p>
+    <w:p>
+      <w:pPr>
+        <w:pStyle w:val="Heading3"/>
+      </w:pPr>
+      <w:r>
+        <w:t>69. 〔答卷#34 · Q1 品牌宣传 · 匿名〕</w:t>
       </w:r>
     </w:p>
     <w:p>
@@ -1710,7 +2528,25 @@
         <w:pStyle w:val="Heading3"/>
       </w:pPr>
       <w:r>
-        <w:t>37. 〔答卷#35 · Q1 品牌宣传 · 匿名〕</w:t>
+        <w:t>70. 〔答卷#34 · Q6 AI应用 · 匿名〕</w:t>
+      </w:r>
+    </w:p>
+    <w:p>
+      <w:r>
+        <w:t>对应题目：Q6 AI应用</w:t>
+      </w:r>
+    </w:p>
+    <w:p>
+      <w:r>
+        <w:t>无</w:t>
+      </w:r>
+    </w:p>
+    <w:p>
+      <w:pPr>
+        <w:pStyle w:val="Heading3"/>
+      </w:pPr>
+      <w:r>
+        <w:t>71. 〔答卷#35 · Q1 品牌宣传 · 匿名〕</w:t>
       </w:r>
     </w:p>
     <w:p>
@@ -1733,7 +2569,30 @@
         <w:pStyle w:val="Heading3"/>
       </w:pPr>
       <w:r>
-        <w:t>38. 〔答卷#36 · Q1 品牌宣传 · 匿名〕</w:t>
+        <w:t>72. 〔答卷#35 · Q6 AI应用 · 匿名〕</w:t>
+      </w:r>
+    </w:p>
+    <w:p>
+      <w:r>
+        <w:t>对应题目：Q6 AI应用</w:t>
+      </w:r>
+    </w:p>
+    <w:p>
+      <w:r>
+        <w:t>工地摄像头接入AI视觉识别，自动识别违规作业、安全隐患、人员的不规范操作，实时告知安全部门。</w:t>
+      </w:r>
+    </w:p>
+    <w:p>
+      <w:r>
+        <w:t>打通国内外设备、库存建材数据，根据各项目施工需求，智能调配闲置资源，减少重复采购。</w:t>
+      </w:r>
+    </w:p>
+    <w:p>
+      <w:pPr>
+        <w:pStyle w:val="Heading3"/>
+      </w:pPr>
+      <w:r>
+        <w:t>73. 〔答卷#36 · Q1 品牌宣传 · 匿名〕</w:t>
       </w:r>
     </w:p>
     <w:p>
@@ -1751,7 +2610,35 @@
         <w:pStyle w:val="Heading3"/>
       </w:pPr>
       <w:r>
-        <w:t>39. 〔答卷#37 · Q1 品牌宣传 · 匿名〕</w:t>
+        <w:t>74. 〔答卷#36 · Q6 AI应用 · 匿名〕</w:t>
+      </w:r>
+    </w:p>
+    <w:p>
+      <w:r>
+        <w:t>对应题目：Q6 AI应用</w:t>
+      </w:r>
+    </w:p>
+    <w:p>
+      <w:r>
+        <w:t>做AI 的主人（管理者），从重复性事务中释放出来，去做经营分析和高价值判断。</w:t>
+      </w:r>
+    </w:p>
+    <w:p>
+      <w:r>
+        <w:t>场景举例：现金流与资金预测，基于历史回款、合同收款节点、应付账款，做滚动现金流预测与缺口预警。</w:t>
+      </w:r>
+    </w:p>
+    <w:p>
+      <w:r>
+        <w:t>要解决的的痛点是：先打通“数据底座”再上Al。没有统一、干净的数据，AI只是“高级搜索”，预测和预警都会失真。</w:t>
+      </w:r>
+    </w:p>
+    <w:p>
+      <w:pPr>
+        <w:pStyle w:val="Heading3"/>
+      </w:pPr>
+      <w:r>
+        <w:t>75. 〔答卷#37 · Q1 品牌宣传 · 匿名〕</w:t>
       </w:r>
     </w:p>
     <w:p>
@@ -1774,7 +2661,25 @@
         <w:pStyle w:val="Heading3"/>
       </w:pPr>
       <w:r>
-        <w:t>40. 〔答卷#38 · Q1 品牌宣传 · 匿名〕</w:t>
+        <w:t>76. 〔答卷#37 · Q6 AI应用 · 匿名〕</w:t>
+      </w:r>
+    </w:p>
+    <w:p>
+      <w:r>
+        <w:t>对应题目：Q6 AI应用</w:t>
+      </w:r>
+    </w:p>
+    <w:p>
+      <w:r>
+        <w:t>无</w:t>
+      </w:r>
+    </w:p>
+    <w:p>
+      <w:pPr>
+        <w:pStyle w:val="Heading3"/>
+      </w:pPr>
+      <w:r>
+        <w:t>77. 〔答卷#38 · Q1 品牌宣传 · 匿名〕</w:t>
       </w:r>
     </w:p>
     <w:p>
@@ -1792,7 +2697,25 @@
         <w:pStyle w:val="Heading3"/>
       </w:pPr>
       <w:r>
-        <w:t>41. 〔答卷#39 · Q1 品牌宣传 · 匿名〕</w:t>
+        <w:t>78. 〔答卷#38 · Q6 AI应用 · 匿名〕</w:t>
+      </w:r>
+    </w:p>
+    <w:p>
+      <w:r>
+        <w:t>对应题目：Q6 AI应用</w:t>
+      </w:r>
+    </w:p>
+    <w:p>
+      <w:r>
+        <w:t>无</w:t>
+      </w:r>
+    </w:p>
+    <w:p>
+      <w:pPr>
+        <w:pStyle w:val="Heading3"/>
+      </w:pPr>
+      <w:r>
+        <w:t>79. 〔答卷#39 · Q1 品牌宣传 · 匿名〕</w:t>
       </w:r>
     </w:p>
     <w:p>
@@ -1810,7 +2733,25 @@
         <w:pStyle w:val="Heading3"/>
       </w:pPr>
       <w:r>
-        <w:t>42. 〔答卷#40 · Q1 品牌宣传 · 匿名〕</w:t>
+        <w:t>80. 〔答卷#39 · Q6 AI应用 · 匿名〕</w:t>
+      </w:r>
+    </w:p>
+    <w:p>
+      <w:r>
+        <w:t>对应题目：Q6 AI应用</w:t>
+      </w:r>
+    </w:p>
+    <w:p>
+      <w:r>
+        <w:t>/</w:t>
+      </w:r>
+    </w:p>
+    <w:p>
+      <w:pPr>
+        <w:pStyle w:val="Heading3"/>
+      </w:pPr>
+      <w:r>
+        <w:t>81. 〔答卷#40 · Q1 品牌宣传 · 匿名〕</w:t>
       </w:r>
     </w:p>
     <w:p>
@@ -1828,7 +2769,25 @@
         <w:pStyle w:val="Heading3"/>
       </w:pPr>
       <w:r>
-        <w:t>43. 〔答卷#41 · Q1 品牌宣传 · 匿名〕</w:t>
+        <w:t>82. 〔答卷#40 · Q6 AI应用 · 匿名〕</w:t>
+      </w:r>
+    </w:p>
+    <w:p>
+      <w:r>
+        <w:t>对应题目：Q6 AI应用</w:t>
+      </w:r>
+    </w:p>
+    <w:p>
+      <w:r>
+        <w:t>/</w:t>
+      </w:r>
+    </w:p>
+    <w:p>
+      <w:pPr>
+        <w:pStyle w:val="Heading3"/>
+      </w:pPr>
+      <w:r>
+        <w:t>83. 〔答卷#41 · Q1 品牌宣传 · 匿名〕</w:t>
       </w:r>
     </w:p>
     <w:p>
@@ -1851,7 +2810,25 @@
         <w:pStyle w:val="Heading3"/>
       </w:pPr>
       <w:r>
-        <w:t>44. 〔答卷#42 · Q1 品牌宣传 · 匿名〕</w:t>
+        <w:t>84. 〔答卷#41 · Q6 AI应用 · 匿名〕</w:t>
+      </w:r>
+    </w:p>
+    <w:p>
+      <w:r>
+        <w:t>对应题目：Q6 AI应用</w:t>
+      </w:r>
+    </w:p>
+    <w:p>
+      <w:r>
+        <w:t>常规流程自动化，自动整理归档项目文件、筛选有效信息减少人工失误，实现第10条开放题的资料问题:公司常用设备的配置AI信息库，日常碎片化的信息能实现统一的归口，不断给AI补充设备物资的准确画像信息</w:t>
+      </w:r>
+    </w:p>
+    <w:p>
+      <w:pPr>
+        <w:pStyle w:val="Heading3"/>
+      </w:pPr>
+      <w:r>
+        <w:t>85. 〔答卷#42 · Q1 品牌宣传 · 匿名〕</w:t>
       </w:r>
     </w:p>
     <w:p>
@@ -1869,7 +2846,35 @@
         <w:pStyle w:val="Heading3"/>
       </w:pPr>
       <w:r>
-        <w:t>45. 〔答卷#43 · Q1 品牌宣传 · 匿名〕</w:t>
+        <w:t>86. 〔答卷#42 · Q6 AI应用 · 匿名〕</w:t>
+      </w:r>
+    </w:p>
+    <w:p>
+      <w:r>
+        <w:t>对应题目：Q6 AI应用</w:t>
+      </w:r>
+    </w:p>
+    <w:p>
+      <w:r>
+        <w:t>公司可开发方案设计 AI机 器人,将 常规场景录入系统。业务人员在沟通中可直接为客户生成方案,</w:t>
+      </w:r>
+    </w:p>
+    <w:p>
+      <w:r>
+        <w:t>直观满足其需求,待客户确认后再交由技术工程师进行深化设计。这样产出的方案更贴合客户预期,修</w:t>
+      </w:r>
+    </w:p>
+    <w:p>
+      <w:r>
+        <w:t>改次数也显著减少。</w:t>
+      </w:r>
+    </w:p>
+    <w:p>
+      <w:pPr>
+        <w:pStyle w:val="Heading3"/>
+      </w:pPr>
+      <w:r>
+        <w:t>87. 〔答卷#43 · Q1 品牌宣传 · 匿名〕</w:t>
       </w:r>
     </w:p>
     <w:p>
@@ -1887,7 +2892,25 @@
         <w:pStyle w:val="Heading3"/>
       </w:pPr>
       <w:r>
-        <w:t>46. 〔答卷#44 · Q1 品牌宣传 · 匿名〕</w:t>
+        <w:t>88. 〔答卷#43 · Q6 AI应用 · 匿名〕</w:t>
+      </w:r>
+    </w:p>
+    <w:p>
+      <w:r>
+        <w:t>对应题目：Q6 AI应用</w:t>
+      </w:r>
+    </w:p>
+    <w:p>
+      <w:r>
+        <w:t>/</w:t>
+      </w:r>
+    </w:p>
+    <w:p>
+      <w:pPr>
+        <w:pStyle w:val="Heading3"/>
+      </w:pPr>
+      <w:r>
+        <w:t>89. 〔答卷#44 · Q1 品牌宣传 · 匿名〕</w:t>
       </w:r>
     </w:p>
     <w:p>
@@ -1905,7 +2928,25 @@
         <w:pStyle w:val="Heading3"/>
       </w:pPr>
       <w:r>
-        <w:t>47. 〔答卷#45 · Q1 品牌宣传 · 匿名〕</w:t>
+        <w:t>90. 〔答卷#44 · Q6 AI应用 · 匿名〕</w:t>
+      </w:r>
+    </w:p>
+    <w:p>
+      <w:r>
+        <w:t>对应题目：Q6 AI应用</w:t>
+      </w:r>
+    </w:p>
+    <w:p>
+      <w:r>
+        <w:t>/</w:t>
+      </w:r>
+    </w:p>
+    <w:p>
+      <w:pPr>
+        <w:pStyle w:val="Heading3"/>
+      </w:pPr>
+      <w:r>
+        <w:t>91. 〔答卷#45 · Q1 品牌宣传 · 匿名〕</w:t>
       </w:r>
     </w:p>
     <w:p>
@@ -1923,7 +2964,25 @@
         <w:pStyle w:val="Heading3"/>
       </w:pPr>
       <w:r>
-        <w:t>48. 〔答卷#46 · Q1 品牌宣传 · 匿名〕</w:t>
+        <w:t>92. 〔答卷#45 · Q6 AI应用 · 匿名〕</w:t>
+      </w:r>
+    </w:p>
+    <w:p>
+      <w:r>
+        <w:t>对应题目：Q6 AI应用</w:t>
+      </w:r>
+    </w:p>
+    <w:p>
+      <w:r>
+        <w:t>员工工龄补贴 ,工作1年工龄多少 、逐年累计增加 。</w:t>
+      </w:r>
+    </w:p>
+    <w:p>
+      <w:pPr>
+        <w:pStyle w:val="Heading3"/>
+      </w:pPr>
+      <w:r>
+        <w:t>93. 〔答卷#46 · Q1 品牌宣传 · 匿名〕</w:t>
       </w:r>
     </w:p>
     <w:p>
@@ -1941,7 +3000,25 @@
         <w:pStyle w:val="Heading3"/>
       </w:pPr>
       <w:r>
-        <w:t>49. 〔答卷#47 · Q1 品牌宣传 · 匿名〕</w:t>
+        <w:t>94. 〔答卷#46 · Q6 AI应用 · 匿名〕</w:t>
+      </w:r>
+    </w:p>
+    <w:p>
+      <w:r>
+        <w:t>对应题目：Q6 AI应用</w:t>
+      </w:r>
+    </w:p>
+    <w:p>
+      <w:r>
+        <w:t>/</w:t>
+      </w:r>
+    </w:p>
+    <w:p>
+      <w:pPr>
+        <w:pStyle w:val="Heading3"/>
+      </w:pPr>
+      <w:r>
+        <w:t>95. 〔答卷#47 · Q1 品牌宣传 · 匿名〕</w:t>
       </w:r>
     </w:p>
     <w:p>
@@ -1969,7 +3046,40 @@
         <w:pStyle w:val="Heading3"/>
       </w:pPr>
       <w:r>
-        <w:t>50. 〔答卷#48 · Q1 品牌宣传 · 匿名〕</w:t>
+        <w:t>96. 〔答卷#47 · Q6 AI应用 · 匿名〕</w:t>
+      </w:r>
+    </w:p>
+    <w:p>
+      <w:r>
+        <w:t>对应题目：Q6 AI应用</w:t>
+      </w:r>
+    </w:p>
+    <w:p>
+      <w:r>
+        <w:t>建议 :首先明确一点,A丨 只是辅助管理工具。</w:t>
+      </w:r>
+    </w:p>
+    <w:p>
+      <w:r>
+        <w:t>AI可 以辅助战略与经营决策,有助于效率提升,可以提前预警项目风险 ;</w:t>
+      </w:r>
+    </w:p>
+    <w:p>
+      <w:r>
+        <w:t>可以初步生成各种技术方案,项 目简介,投标初稿文件,可 以自动整理相关同类样板的工程案例等。</w:t>
+      </w:r>
+    </w:p>
+    <w:p>
+      <w:r>
+        <w:t>一定要注意公司核心数据的安全,重要的涉及筒仓工艺参数和项 目信息等商业秘密,禁止上传。</w:t>
+      </w:r>
+    </w:p>
+    <w:p>
+      <w:pPr>
+        <w:pStyle w:val="Heading3"/>
+      </w:pPr>
+      <w:r>
+        <w:t>97. 〔答卷#48 · Q1 品牌宣传 · 匿名〕</w:t>
       </w:r>
     </w:p>
     <w:p>
@@ -1987,7 +3097,25 @@
         <w:pStyle w:val="Heading3"/>
       </w:pPr>
       <w:r>
-        <w:t>51. 〔答卷#49 · Q1 品牌宣传 · 孙亚伟〕</w:t>
+        <w:t>98. 〔答卷#48 · Q6 AI应用 · 匿名〕</w:t>
+      </w:r>
+    </w:p>
+    <w:p>
+      <w:r>
+        <w:t>对应题目：Q6 AI应用</w:t>
+      </w:r>
+    </w:p>
+    <w:p>
+      <w:r>
+        <w:t>公司管理工作重复性太多,Ai能自动归整和汇总成报告,减少重复工作!</w:t>
+      </w:r>
+    </w:p>
+    <w:p>
+      <w:pPr>
+        <w:pStyle w:val="Heading3"/>
+      </w:pPr>
+      <w:r>
+        <w:t>99. 〔答卷#49 · Q1 品牌宣传 · 孙亚伟〕</w:t>
       </w:r>
     </w:p>
     <w:p>
@@ -2010,7 +3138,25 @@
         <w:pStyle w:val="Heading3"/>
       </w:pPr>
       <w:r>
-        <w:t>52. 〔答卷#50 · Q1 品牌宣传 · 匿名〕</w:t>
+        <w:t>100. 〔答卷#49 · Q6 AI应用 · 孙亚伟〕</w:t>
+      </w:r>
+    </w:p>
+    <w:p>
+      <w:r>
+        <w:t>对应题目：Q6 AI应用</w:t>
+      </w:r>
+    </w:p>
+    <w:p>
+      <w:r>
+        <w:t>能否引入软件 APP，提前输入采购合同技术文本，通过拍照自动对比物资品牌、型号、外观，识别以次充好、参数不符等问题，提高核对效率。</w:t>
+      </w:r>
+    </w:p>
+    <w:p>
+      <w:pPr>
+        <w:pStyle w:val="Heading3"/>
+      </w:pPr>
+      <w:r>
+        <w:t>101. 〔答卷#50 · Q1 品牌宣传 · 匿名〕</w:t>
       </w:r>
     </w:p>
     <w:p>
@@ -2028,7 +3174,7 @@
         <w:pStyle w:val="Heading3"/>
       </w:pPr>
       <w:r>
-        <w:t>53. 〔答卷#51 · Q1 品牌宣传 · 刘一〕</w:t>
+        <w:t>102. 〔答卷#51 · Q1 品牌宣传 · 刘一〕</w:t>
       </w:r>
     </w:p>
     <w:p>
@@ -2046,7 +3192,81 @@
         <w:pStyle w:val="Heading3"/>
       </w:pPr>
       <w:r>
-        <w:t>54. 〔答卷#52 · Q1 品牌宣传 · 王闯〕</w:t>
+        <w:t>103. 〔答卷#51 · Q2 产品与赛道定位 · 刘一〕</w:t>
+      </w:r>
+    </w:p>
+    <w:p>
+      <w:r>
+        <w:t>对应题目：Q2 产品与赛道定位</w:t>
+      </w:r>
+    </w:p>
+    <w:p>
+      <w:r>
+        <w:t>可探索为已交付的项目提供后续的备件供应、运维、巡检等服务，形成稳定长期的收入来源，并且可以防范因工程项目的不稳定导致的业绩波动过大的经营风险；构建 “EPC 工程 + 后期运维” 的双轮驱动模式；【可以结合目前新兴的人工智能，提高项目的智能化、算法等，提高后期运维的门槛，建立自己的护城河】</w:t>
+      </w:r>
+    </w:p>
+    <w:p>
+      <w:pPr>
+        <w:pStyle w:val="Heading3"/>
+      </w:pPr>
+      <w:r>
+        <w:t>104. 〔答卷#51 · Q5 项目执行 · 刘一〕</w:t>
+      </w:r>
+    </w:p>
+    <w:p>
+      <w:r>
+        <w:t>对应题目：Q5 项目执行</w:t>
+      </w:r>
+    </w:p>
+    <w:p>
+      <w:r>
+        <w:t>个人看法：目前影响交付效率和质量，更多的原因可能是各个部门的信息交互不够紧密，方案变更频繁，业主诉求等沟通不到位，比如最近菲律宾项目，突然告知业主要开具劳工证，导致公司需要仓促对接中介机构沟通相关事宜，势必会影响项目进度；</w:t>
+      </w:r>
+    </w:p>
+    <w:p>
+      <w:r>
+        <w:t>对此，一来，是否可以形成一个类似需求模版，跟业主对接时候形成一个纸面明确的需求清单，并且表明后续变更要调整报价，并且及时沟通信息；二来，正如上面所说，可以将打单过程形成记录、文档，借助现在的人工智能，大模型，把这些数据喂给大模型，数据足够多了以后，可以借助大模型，在有新的打单时，可以提前预测风险，和可能的需求，提高打单的成功率；甚至可以将整个执行过程的时间节点、工程记录等等数据都喂给大模型，可以用于及时发现和总结执行过程中的问题，提高后续交付效率；</w:t>
+      </w:r>
+    </w:p>
+    <w:p>
+      <w:pPr>
+        <w:pStyle w:val="Heading3"/>
+      </w:pPr>
+      <w:r>
+        <w:t>105. 〔答卷#51 · Q6 AI应用 · 刘一〕</w:t>
+      </w:r>
+    </w:p>
+    <w:p>
+      <w:r>
+        <w:t>对应题目：Q6 AI应用</w:t>
+      </w:r>
+    </w:p>
+    <w:p>
+      <w:r>
+        <w:t>正如上面所说，在保证信息安全的前提下：</w:t>
+      </w:r>
+    </w:p>
+    <w:p>
+      <w:r>
+        <w:t>营销端赋能：可以将打单过程，不论是成功还是失败的例子，沟通记录等信息作为大数据，交给人工智能去进行分析，提高打单效率；</w:t>
+      </w:r>
+    </w:p>
+    <w:p>
+      <w:r>
+        <w:t>项目全周期提效：将执行过程中遇到的问题，节点等信息，甚至整个执行周期的数据，都可以作为大数据留存在系统里，年底可以借助大数据分析，将所有的信息归纳总结梳理，分析出会被日常管理遗漏的细节等，提高项目执行全周期的效率；</w:t>
+      </w:r>
+    </w:p>
+    <w:p>
+      <w:r>
+        <w:t>采购智能化：建立供应商库，将我们的比价信息，采购信息，品牌、价格、规格型号等，这些数据，借助大模型，可以帮助企业甄选供应商，提供报价依据，测算成本，项目结束以后，可以根据成本的信息，分析出成本超支或者节支的情况，提供考核依据，完善日后成本管理效果；</w:t>
+      </w:r>
+    </w:p>
+    <w:p>
+      <w:pPr>
+        <w:pStyle w:val="Heading3"/>
+      </w:pPr>
+      <w:r>
+        <w:t>106. 〔答卷#52 · Q1 品牌宣传 · 王闯〕</w:t>
       </w:r>
     </w:p>
     <w:p>
@@ -2084,7 +3304,35 @@
         <w:pStyle w:val="Heading3"/>
       </w:pPr>
       <w:r>
-        <w:t>55. 〔答卷#54 · Q1 品牌宣传 · 匿名〕</w:t>
+        <w:t>107. 〔答卷#52 · Q6 AI应用 · 王闯〕</w:t>
+      </w:r>
+    </w:p>
+    <w:p>
+      <w:r>
+        <w:t>对应题目：Q6 AI应用</w:t>
+      </w:r>
+    </w:p>
+    <w:p>
+      <w:r>
+        <w:t>1）组织层面，补充经验盲区：AI 应该被视为数字员工，在参与到重大决策、人才选育用留、财务分析、预决算、绩效管理、研发设计图出整套方案、品牌市场营销客服、物资采购、质检（AI 视觉）等。</w:t>
+      </w:r>
+    </w:p>
+    <w:p>
+      <w:r>
+        <w:t>2）人机共同，提升工作效率：AI 应该被每一位员工，在日常工作流中深度应用。各岗位都需要对应的 Agent 协助工作。建议成立 AI 工作小组，梳理各岗位 Agent 训练。所有人找到自己的部分工作流，自己负责前端 10% 指令输入和后端 10% 审查交付责任，中间的 80% 交由 Agent 完成。</w:t>
+      </w:r>
+    </w:p>
+    <w:p>
+      <w:r>
+        <w:t>3）本地部署，开放岗位端口：最好是部署一台高配电脑，并本地化部署（数据安全需要）当下最强大的几个模型，并将所有资料清洗后投喂进去，将 AI 培养为实荣数字员工，并向所有员工设置权限开发。</w:t>
+      </w:r>
+    </w:p>
+    <w:p>
+      <w:pPr>
+        <w:pStyle w:val="Heading3"/>
+      </w:pPr>
+      <w:r>
+        <w:t>108. 〔答卷#54 · Q1 品牌宣传 · 匿名〕</w:t>
       </w:r>
     </w:p>
     <w:p>
@@ -2102,7 +3350,25 @@
         <w:pStyle w:val="Heading3"/>
       </w:pPr>
       <w:r>
-        <w:t>56. 〔答卷#55 · Q1 品牌宣传 · 匿名〕</w:t>
+        <w:t>109. 〔答卷#54 · Q6 AI应用 · 匿名〕</w:t>
+      </w:r>
+    </w:p>
+    <w:p>
+      <w:r>
+        <w:t>对应题目：Q6 AI应用</w:t>
+      </w:r>
+    </w:p>
+    <w:p>
+      <w:r>
+        <w:t>1. AI 可应用公司网站宣传，分专题集成客户常见疑问解答，产品展示等。</w:t>
+      </w:r>
+    </w:p>
+    <w:p>
+      <w:pPr>
+        <w:pStyle w:val="Heading3"/>
+      </w:pPr>
+      <w:r>
+        <w:t>110. 〔答卷#55 · Q1 品牌宣传 · 匿名〕</w:t>
       </w:r>
     </w:p>
     <w:p>
@@ -2120,7 +3386,35 @@
         <w:pStyle w:val="Heading3"/>
       </w:pPr>
       <w:r>
-        <w:t>57. 〔答卷#56 · Q1 品牌宣传 · 匿名〕</w:t>
+        <w:t>111. 〔答卷#55 · Q6 AI应用 · 匿名〕</w:t>
+      </w:r>
+    </w:p>
+    <w:p>
+      <w:r>
+        <w:t>对应题目：Q6 AI应用</w:t>
+      </w:r>
+    </w:p>
+    <w:p>
+      <w:r>
+        <w:t>AI 的重要应用，有生物医药科技，信息科技，法律。</w:t>
+      </w:r>
+    </w:p>
+    <w:p>
+      <w:r>
+        <w:t>公司可以从信息科技入手，获取更多的客户信息和产业发展趋势。</w:t>
+      </w:r>
+    </w:p>
+    <w:p>
+      <w:r>
+        <w:t>公司同时应该注意加强合规经营的风险防范意识，因为，AI 相当于给每个人配备了私人律师。</w:t>
+      </w:r>
+    </w:p>
+    <w:p>
+      <w:pPr>
+        <w:pStyle w:val="Heading3"/>
+      </w:pPr>
+      <w:r>
+        <w:t>112. 〔答卷#56 · Q1 品牌宣传 · 匿名〕</w:t>
       </w:r>
     </w:p>
     <w:p>
@@ -2143,7 +3437,25 @@
         <w:pStyle w:val="Heading3"/>
       </w:pPr>
       <w:r>
-        <w:t>58. 〔答卷#57 · Q1 品牌宣传 · 匿名〕</w:t>
+        <w:t>113. 〔答卷#56 · Q6 AI应用 · 匿名〕</w:t>
+      </w:r>
+    </w:p>
+    <w:p>
+      <w:r>
+        <w:t>对应题目：Q6 AI应用</w:t>
+      </w:r>
+    </w:p>
+    <w:p>
+      <w:r>
+        <w:t>1. 利用 ai 智能程序完成加工过程中初步建模，及时发现施工图中的问题，降低后期错误成本；</w:t>
+      </w:r>
+    </w:p>
+    <w:p>
+      <w:pPr>
+        <w:pStyle w:val="Heading3"/>
+      </w:pPr>
+      <w:r>
+        <w:t>114. 〔答卷#57 · Q1 品牌宣传 · 匿名〕</w:t>
       </w:r>
     </w:p>
     <w:p>
@@ -2159,6 +3471,39 @@
     <w:p>
       <w:r>
         <w:t>可视化交付过程：利用无人机航拍和延时摄影，记录海外项目的从无到有。也许这种视觉冲击力强的内容非常适合在 YouTube 等平台传播，能直观展示公司的工程实力。</w:t>
+      </w:r>
+    </w:p>
+    <w:p>
+      <w:pPr>
+        <w:pStyle w:val="Heading3"/>
+      </w:pPr>
+      <w:r>
+        <w:t>115. 〔答卷#57 · Q6 AI应用 · 匿名〕</w:t>
+      </w:r>
+    </w:p>
+    <w:p>
+      <w:r>
+        <w:t>对应题目：Q6 AI应用</w:t>
+      </w:r>
+    </w:p>
+    <w:p>
+      <w:r>
+        <w:t>AI 赋能应该直接指向降本、增效、增收、控险四大核心业务目标。</w:t>
+      </w:r>
+    </w:p>
+    <w:p>
+      <w:r>
+        <w:t>筒仓作为高度定制化的产品，技术参数复杂，海外销售如果面对客户的咨询时，需要技术的支持，但可能会存在时差或者语言障碍，导致响应慢、商机流失。</w:t>
+      </w:r>
+    </w:p>
+    <w:p>
+      <w:r>
+        <w:t>AI 解决方案：建立 “筒仓工程技术知识库”。将过往的工程图纸、技术规格书、大概报价加载进去。配置多语言智能助手，让海外销售能随时用当地语言查询技术参数，甚至自动生成初步的方案建议书。</w:t>
+      </w:r>
+    </w:p>
+    <w:p>
+      <w:r>
+        <w:t>阅读过一篇安可创新公司的网上文章，“安克每年在充电、影音和智能家居领域发布近一百款新产品，累计在售的产品数量超过 500 种。而我们在全球近 500 位销售伙伴以及外部的分销伙伴，每天都会产生大量针对这些产品的问题，包括竞品对比问题。过往这些问题都是由 GTM 同事手工作答，时效性、语言准确度等都无法保证。基于飞书的智能伙伴，我们针对每个业务品类配置了产品助手。把知识库里面产品相关的文档加载进去，产品助手就能用 10 种语言，7x24 小时及时回答销售同事的产品问题，并提供答案出处的文档，高效实现了产品问题答疑。安克创新还强调，更大的机会在于如何将企业内部大量存在于业务人员头脑中、潜移默化形成的 “know-how” 转化为高质量的数据。”</w:t>
       </w:r>
     </w:p>
     <w:p>

</xml_diff>